<commit_message>
adde first version of work program comparison
</commit_message>
<xml_diff>
--- a/docs/5. work-program-template.docx
+++ b/docs/5. work-program-template.docx
@@ -412,7 +412,21 @@
         <w:rPr>
           <w:rFonts w:asciiTheme="minorHAnsi" w:hAnsiTheme="minorHAnsi" w:cstheme="minorHAnsi"/>
         </w:rPr>
-        <w:t xml:space="preserve"> office is committed to provide conducive </w:t>
+        <w:t xml:space="preserve"> office is committed to </w:t>
+      </w:r>
+      <w:proofErr w:type="gramStart"/>
+      <w:r>
+        <w:rPr>
+          <w:rFonts w:asciiTheme="minorHAnsi" w:hAnsiTheme="minorHAnsi" w:cstheme="minorHAnsi"/>
+        </w:rPr>
+        <w:t>provide</w:t>
+      </w:r>
+      <w:proofErr w:type="gramEnd"/>
+      <w:r>
+        <w:rPr>
+          <w:rFonts w:asciiTheme="minorHAnsi" w:hAnsiTheme="minorHAnsi" w:cstheme="minorHAnsi"/>
+        </w:rPr>
+        <w:t xml:space="preserve"> conducive </w:t>
       </w:r>
       <w:r>
         <w:rPr>
@@ -1088,6 +1102,15 @@
               </w:rPr>
               <w:t>ACCOUNT CODE</w:t>
             </w:r>
+            <w:r>
+              <w:rPr>
+                <w:rFonts w:ascii="Calibri" w:hAnsi="Calibri"/>
+                <w:b/>
+                <w:sz w:val="28"/>
+                <w:szCs w:val="28"/>
+              </w:rPr>
+              <w:t xml:space="preserve"> </w:t>
+            </w:r>
           </w:p>
         </w:tc>
         <w:tc>
@@ -1613,7 +1636,7 @@
               <w:rPr>
                 <w:rFonts w:ascii="Calibri" w:hAnsi="Calibri" w:cs="Calibri"/>
               </w:rPr>
-              <w:t>Blackscrew #1 (for wood)</w:t>
+              <w:t>Training Kit</w:t>
             </w:r>
           </w:p>
         </w:tc>
@@ -1640,7 +1663,7 @@
               <w:rPr>
                 <w:rFonts w:ascii="Calibri" w:hAnsi="Calibri" w:cs="Calibri"/>
               </w:rPr>
-              <w:t>200</w:t>
+              <w:t>20</w:t>
             </w:r>
             <w:r>
               <w:rPr>
@@ -1746,11 +1769,19 @@
                 <w:rFonts w:ascii="Calibri" w:hAnsi="Calibri" w:cs="Calibri"/>
               </w:rPr>
             </w:pPr>
-            <w:r>
-              <w:rPr>
-                <w:rFonts w:ascii="Calibri" w:hAnsi="Calibri" w:cs="Calibri"/>
-              </w:rPr>
-              <w:t>Blackscrew #1 (for metal)</w:t>
+            <w:proofErr w:type="spellStart"/>
+            <w:r>
+              <w:rPr>
+                <w:rFonts w:ascii="Calibri" w:hAnsi="Calibri" w:cs="Calibri"/>
+              </w:rPr>
+              <w:t>Blackscrew</w:t>
+            </w:r>
+            <w:proofErr w:type="spellEnd"/>
+            <w:r>
+              <w:rPr>
+                <w:rFonts w:ascii="Calibri" w:hAnsi="Calibri" w:cs="Calibri"/>
+              </w:rPr>
+              <w:t xml:space="preserve"> #1 (for metal)</w:t>
             </w:r>
           </w:p>
         </w:tc>
@@ -1883,11 +1914,19 @@
                 <w:rFonts w:ascii="Calibri" w:hAnsi="Calibri" w:cs="Calibri"/>
               </w:rPr>
             </w:pPr>
-            <w:r>
-              <w:rPr>
-                <w:rFonts w:ascii="Calibri" w:hAnsi="Calibri" w:cs="Calibri"/>
-              </w:rPr>
-              <w:t>Blackscrew #1-½ (for wood)</w:t>
+            <w:proofErr w:type="spellStart"/>
+            <w:r>
+              <w:rPr>
+                <w:rFonts w:ascii="Calibri" w:hAnsi="Calibri" w:cs="Calibri"/>
+              </w:rPr>
+              <w:t>Blackscrew</w:t>
+            </w:r>
+            <w:proofErr w:type="spellEnd"/>
+            <w:r>
+              <w:rPr>
+                <w:rFonts w:ascii="Calibri" w:hAnsi="Calibri" w:cs="Calibri"/>
+              </w:rPr>
+              <w:t xml:space="preserve"> #1-½ (for wood)</w:t>
             </w:r>
           </w:p>
         </w:tc>
@@ -2013,11 +2052,19 @@
                 <w:rFonts w:ascii="Calibri" w:hAnsi="Calibri" w:cs="Calibri"/>
               </w:rPr>
             </w:pPr>
-            <w:r>
-              <w:rPr>
-                <w:rFonts w:ascii="Calibri" w:hAnsi="Calibri" w:cs="Calibri"/>
-              </w:rPr>
-              <w:t>Blackscrew #1-½ (metal)</w:t>
+            <w:proofErr w:type="spellStart"/>
+            <w:r>
+              <w:rPr>
+                <w:rFonts w:ascii="Calibri" w:hAnsi="Calibri" w:cs="Calibri"/>
+              </w:rPr>
+              <w:t>Blackscrew</w:t>
+            </w:r>
+            <w:proofErr w:type="spellEnd"/>
+            <w:r>
+              <w:rPr>
+                <w:rFonts w:ascii="Calibri" w:hAnsi="Calibri" w:cs="Calibri"/>
+              </w:rPr>
+              <w:t xml:space="preserve"> #1-½ (metal)</w:t>
             </w:r>
           </w:p>
         </w:tc>
@@ -2143,11 +2190,19 @@
                 <w:rFonts w:ascii="Calibri" w:hAnsi="Calibri" w:cs="Calibri"/>
               </w:rPr>
             </w:pPr>
-            <w:r>
-              <w:rPr>
-                <w:rFonts w:ascii="Calibri" w:hAnsi="Calibri" w:cs="Calibri"/>
-              </w:rPr>
-              <w:t>Blackscrew #2-½ (for wood)</w:t>
+            <w:proofErr w:type="spellStart"/>
+            <w:r>
+              <w:rPr>
+                <w:rFonts w:ascii="Calibri" w:hAnsi="Calibri" w:cs="Calibri"/>
+              </w:rPr>
+              <w:t>Blackscrew</w:t>
+            </w:r>
+            <w:proofErr w:type="spellEnd"/>
+            <w:r>
+              <w:rPr>
+                <w:rFonts w:ascii="Calibri" w:hAnsi="Calibri" w:cs="Calibri"/>
+              </w:rPr>
+              <w:t xml:space="preserve"> #2-½ (for wood)</w:t>
             </w:r>
           </w:p>
         </w:tc>
@@ -2273,11 +2328,19 @@
                 <w:rFonts w:ascii="Calibri" w:hAnsi="Calibri" w:cs="Calibri"/>
               </w:rPr>
             </w:pPr>
-            <w:r>
-              <w:rPr>
-                <w:rFonts w:ascii="Calibri" w:hAnsi="Calibri" w:cs="Calibri"/>
-              </w:rPr>
-              <w:t>Blackscrew #2-½ (for metal)</w:t>
+            <w:proofErr w:type="spellStart"/>
+            <w:r>
+              <w:rPr>
+                <w:rFonts w:ascii="Calibri" w:hAnsi="Calibri" w:cs="Calibri"/>
+              </w:rPr>
+              <w:t>Blackscrew</w:t>
+            </w:r>
+            <w:proofErr w:type="spellEnd"/>
+            <w:r>
+              <w:rPr>
+                <w:rFonts w:ascii="Calibri" w:hAnsi="Calibri" w:cs="Calibri"/>
+              </w:rPr>
+              <w:t xml:space="preserve"> #2-½ (for metal)</w:t>
             </w:r>
           </w:p>
         </w:tc>
@@ -2543,7 +2606,7 @@
               <w:rPr>
                 <w:rFonts w:ascii="Calibri" w:hAnsi="Calibri" w:cs="Calibri"/>
               </w:rPr>
-              <w:t>Concrete Nails #1</w:t>
+              <w:t>Honorarium for Resource Person</w:t>
             </w:r>
           </w:p>
         </w:tc>
@@ -2685,7 +2748,7 @@
               <w:rPr>
                 <w:rFonts w:ascii="Calibri" w:hAnsi="Calibri" w:cs="Calibri"/>
               </w:rPr>
-              <w:t>Concrete Nails #1-½</w:t>
+              <w:t>Meals &amp; Snacks (AM Snacks &amp; Lunch)</w:t>
             </w:r>
           </w:p>
         </w:tc>
@@ -4099,11 +4162,33 @@
                 <w:rFonts w:ascii="Calibri" w:hAnsi="Calibri" w:cs="Calibri"/>
               </w:rPr>
             </w:pPr>
-            <w:r>
-              <w:rPr>
-                <w:rFonts w:ascii="Calibri" w:hAnsi="Calibri" w:cs="Calibri"/>
-              </w:rPr>
-              <w:t>Door Knob ( heavy duty)</w:t>
+            <w:proofErr w:type="gramStart"/>
+            <w:r>
+              <w:rPr>
+                <w:rFonts w:ascii="Calibri" w:hAnsi="Calibri" w:cs="Calibri"/>
+              </w:rPr>
+              <w:t>Door Knob</w:t>
+            </w:r>
+            <w:proofErr w:type="gramEnd"/>
+            <w:r>
+              <w:rPr>
+                <w:rFonts w:ascii="Calibri" w:hAnsi="Calibri" w:cs="Calibri"/>
+              </w:rPr>
+              <w:t xml:space="preserve"> </w:t>
+            </w:r>
+            <w:proofErr w:type="gramStart"/>
+            <w:r>
+              <w:rPr>
+                <w:rFonts w:ascii="Calibri" w:hAnsi="Calibri" w:cs="Calibri"/>
+              </w:rPr>
+              <w:t>( heavy</w:t>
+            </w:r>
+            <w:proofErr w:type="gramEnd"/>
+            <w:r>
+              <w:rPr>
+                <w:rFonts w:ascii="Calibri" w:hAnsi="Calibri" w:cs="Calibri"/>
+              </w:rPr>
+              <w:t xml:space="preserve"> duty)</w:t>
             </w:r>
           </w:p>
         </w:tc>
@@ -5958,7 +6043,21 @@
               <w:rPr>
                 <w:rFonts w:ascii="Calibri" w:hAnsi="Calibri" w:cs="Calibri"/>
               </w:rPr>
-              <w:t>Padlock 50 mm  (heavy duty)</w:t>
+              <w:t xml:space="preserve">Padlock 50 </w:t>
+            </w:r>
+            <w:proofErr w:type="gramStart"/>
+            <w:r>
+              <w:rPr>
+                <w:rFonts w:ascii="Calibri" w:hAnsi="Calibri" w:cs="Calibri"/>
+              </w:rPr>
+              <w:t>mm  (</w:t>
+            </w:r>
+            <w:proofErr w:type="gramEnd"/>
+            <w:r>
+              <w:rPr>
+                <w:rFonts w:ascii="Calibri" w:hAnsi="Calibri" w:cs="Calibri"/>
+              </w:rPr>
+              <w:t>heavy duty)</w:t>
             </w:r>
           </w:p>
         </w:tc>
@@ -6518,7 +6617,21 @@
               <w:rPr>
                 <w:rFonts w:ascii="Calibri" w:hAnsi="Calibri" w:cs="Calibri"/>
               </w:rPr>
-              <w:t>½" x 1" x 8' liston (K.D.</w:t>
+              <w:t xml:space="preserve">½" x 1" x 8' </w:t>
+            </w:r>
+            <w:proofErr w:type="spellStart"/>
+            <w:r>
+              <w:rPr>
+                <w:rFonts w:ascii="Calibri" w:hAnsi="Calibri" w:cs="Calibri"/>
+              </w:rPr>
+              <w:t>liston</w:t>
+            </w:r>
+            <w:proofErr w:type="spellEnd"/>
+            <w:r>
+              <w:rPr>
+                <w:rFonts w:ascii="Calibri" w:hAnsi="Calibri" w:cs="Calibri"/>
+              </w:rPr>
+              <w:t xml:space="preserve"> (K.D.</w:t>
             </w:r>
             <w:r>
               <w:rPr>
@@ -6663,8 +6776,16 @@
               <w:rPr>
                 <w:rFonts w:ascii="Calibri" w:hAnsi="Calibri" w:cs="Calibri"/>
               </w:rPr>
-              <w:t>½" x 2" x 8' liston</w:t>
-            </w:r>
+              <w:t xml:space="preserve">½" x 2" x 8' </w:t>
+            </w:r>
+            <w:proofErr w:type="spellStart"/>
+            <w:r>
+              <w:rPr>
+                <w:rFonts w:ascii="Calibri" w:hAnsi="Calibri" w:cs="Calibri"/>
+              </w:rPr>
+              <w:t>liston</w:t>
+            </w:r>
+            <w:proofErr w:type="spellEnd"/>
           </w:p>
         </w:tc>
         <w:tc>
@@ -7207,7 +7328,21 @@
               <w:rPr>
                 <w:rFonts w:ascii="Calibri" w:hAnsi="Calibri" w:cs="Calibri"/>
               </w:rPr>
-              <w:t>2" x 2" x 8' Good Lumber ( Tanguile ) S4S</w:t>
+              <w:t xml:space="preserve">2" x 2" x 8' Good Lumber </w:t>
+            </w:r>
+            <w:proofErr w:type="gramStart"/>
+            <w:r>
+              <w:rPr>
+                <w:rFonts w:ascii="Calibri" w:hAnsi="Calibri" w:cs="Calibri"/>
+              </w:rPr>
+              <w:t>( Tanguile</w:t>
+            </w:r>
+            <w:proofErr w:type="gramEnd"/>
+            <w:r>
+              <w:rPr>
+                <w:rFonts w:ascii="Calibri" w:hAnsi="Calibri" w:cs="Calibri"/>
+              </w:rPr>
+              <w:t xml:space="preserve"> ) S4S</w:t>
             </w:r>
           </w:p>
         </w:tc>
@@ -7346,7 +7481,21 @@
               <w:rPr>
                 <w:rFonts w:ascii="Calibri" w:hAnsi="Calibri" w:cs="Calibri"/>
               </w:rPr>
-              <w:t>2" x 2" x 10' Good Lumber ( Tanguile ) S4S</w:t>
+              <w:t xml:space="preserve">2" x 2" x 10' Good Lumber </w:t>
+            </w:r>
+            <w:proofErr w:type="gramStart"/>
+            <w:r>
+              <w:rPr>
+                <w:rFonts w:ascii="Calibri" w:hAnsi="Calibri" w:cs="Calibri"/>
+              </w:rPr>
+              <w:t>( Tanguile</w:t>
+            </w:r>
+            <w:proofErr w:type="gramEnd"/>
+            <w:r>
+              <w:rPr>
+                <w:rFonts w:ascii="Calibri" w:hAnsi="Calibri" w:cs="Calibri"/>
+              </w:rPr>
+              <w:t xml:space="preserve"> ) S4S</w:t>
             </w:r>
           </w:p>
         </w:tc>
@@ -7760,7 +7909,21 @@
               <w:rPr>
                 <w:rFonts w:ascii="Calibri" w:hAnsi="Calibri" w:cs="Calibri"/>
               </w:rPr>
-              <w:t>2" x 3" x 10' Good Lumber ( Tanguile ) S4S</w:t>
+              <w:t xml:space="preserve">2" x 3" x 10' Good Lumber </w:t>
+            </w:r>
+            <w:proofErr w:type="gramStart"/>
+            <w:r>
+              <w:rPr>
+                <w:rFonts w:ascii="Calibri" w:hAnsi="Calibri" w:cs="Calibri"/>
+              </w:rPr>
+              <w:t>( Tanguile</w:t>
+            </w:r>
+            <w:proofErr w:type="gramEnd"/>
+            <w:r>
+              <w:rPr>
+                <w:rFonts w:ascii="Calibri" w:hAnsi="Calibri" w:cs="Calibri"/>
+              </w:rPr>
+              <w:t xml:space="preserve"> ) S4S</w:t>
             </w:r>
           </w:p>
         </w:tc>
@@ -8136,8 +8299,16 @@
               <w:rPr>
                 <w:rFonts w:ascii="Calibri" w:hAnsi="Calibri" w:cs="Calibri"/>
               </w:rPr>
-              <w:t>Angle bar 2" x 2" x ¼ thk</w:t>
-            </w:r>
+              <w:t xml:space="preserve">Angle bar 2" x 2" x ¼ </w:t>
+            </w:r>
+            <w:proofErr w:type="spellStart"/>
+            <w:r>
+              <w:rPr>
+                <w:rFonts w:ascii="Calibri" w:hAnsi="Calibri" w:cs="Calibri"/>
+              </w:rPr>
+              <w:t>thk</w:t>
+            </w:r>
+            <w:proofErr w:type="spellEnd"/>
           </w:p>
         </w:tc>
         <w:tc>
@@ -8308,8 +8479,16 @@
               <w:rPr>
                 <w:rFonts w:ascii="Calibri" w:hAnsi="Calibri" w:cs="Calibri"/>
               </w:rPr>
-              <w:t>" x ¼ thk</w:t>
-            </w:r>
+              <w:t xml:space="preserve">" x ¼ </w:t>
+            </w:r>
+            <w:proofErr w:type="spellStart"/>
+            <w:r>
+              <w:rPr>
+                <w:rFonts w:ascii="Calibri" w:hAnsi="Calibri" w:cs="Calibri"/>
+              </w:rPr>
+              <w:t>thk</w:t>
+            </w:r>
+            <w:proofErr w:type="spellEnd"/>
           </w:p>
         </w:tc>
         <w:tc>
@@ -8456,7 +8635,21 @@
               <w:rPr>
                 <w:rFonts w:ascii="Calibri" w:hAnsi="Calibri" w:cs="Calibri"/>
               </w:rPr>
-              <w:t xml:space="preserve">Angle bar 1 x 1 x ¼" thk </w:t>
+              <w:t xml:space="preserve">Angle bar 1 x 1 x ¼" </w:t>
+            </w:r>
+            <w:proofErr w:type="spellStart"/>
+            <w:r>
+              <w:rPr>
+                <w:rFonts w:ascii="Calibri" w:hAnsi="Calibri" w:cs="Calibri"/>
+              </w:rPr>
+              <w:t>thk</w:t>
+            </w:r>
+            <w:proofErr w:type="spellEnd"/>
+            <w:r>
+              <w:rPr>
+                <w:rFonts w:ascii="Calibri" w:hAnsi="Calibri" w:cs="Calibri"/>
+              </w:rPr>
+              <w:t xml:space="preserve"> </w:t>
             </w:r>
           </w:p>
         </w:tc>
@@ -10066,11 +10259,19 @@
                 <w:rFonts w:ascii="Calibri" w:hAnsi="Calibri" w:cs="Calibri"/>
               </w:rPr>
             </w:pPr>
-            <w:r>
-              <w:rPr>
-                <w:rFonts w:ascii="Calibri" w:hAnsi="Calibri" w:cs="Calibri"/>
-              </w:rPr>
-              <w:t>Flatwall Enamel</w:t>
+            <w:proofErr w:type="spellStart"/>
+            <w:r>
+              <w:rPr>
+                <w:rFonts w:ascii="Calibri" w:hAnsi="Calibri" w:cs="Calibri"/>
+              </w:rPr>
+              <w:t>Flatwall</w:t>
+            </w:r>
+            <w:proofErr w:type="spellEnd"/>
+            <w:r>
+              <w:rPr>
+                <w:rFonts w:ascii="Calibri" w:hAnsi="Calibri" w:cs="Calibri"/>
+              </w:rPr>
+              <w:t xml:space="preserve"> Enamel</w:t>
             </w:r>
           </w:p>
         </w:tc>
@@ -10218,7 +10419,21 @@
               <w:rPr>
                 <w:rFonts w:ascii="Calibri" w:hAnsi="Calibri" w:cs="Calibri"/>
               </w:rPr>
-              <w:t>Gloss Latex ( white )</w:t>
+              <w:t xml:space="preserve">Gloss Latex </w:t>
+            </w:r>
+            <w:proofErr w:type="gramStart"/>
+            <w:r>
+              <w:rPr>
+                <w:rFonts w:ascii="Calibri" w:hAnsi="Calibri" w:cs="Calibri"/>
+              </w:rPr>
+              <w:t>( white</w:t>
+            </w:r>
+            <w:proofErr w:type="gramEnd"/>
+            <w:r>
+              <w:rPr>
+                <w:rFonts w:ascii="Calibri" w:hAnsi="Calibri" w:cs="Calibri"/>
+              </w:rPr>
+              <w:t xml:space="preserve"> )</w:t>
             </w:r>
           </w:p>
         </w:tc>
@@ -10555,7 +10770,21 @@
               <w:rPr>
                 <w:rFonts w:ascii="Calibri" w:hAnsi="Calibri" w:cs="Calibri"/>
               </w:rPr>
-              <w:t>Latex Paint (Semi gloss white)</w:t>
+              <w:t>Latex Paint (</w:t>
+            </w:r>
+            <w:proofErr w:type="spellStart"/>
+            <w:r>
+              <w:rPr>
+                <w:rFonts w:ascii="Calibri" w:hAnsi="Calibri" w:cs="Calibri"/>
+              </w:rPr>
+              <w:t>Semi gloss</w:t>
+            </w:r>
+            <w:proofErr w:type="spellEnd"/>
+            <w:r>
+              <w:rPr>
+                <w:rFonts w:ascii="Calibri" w:hAnsi="Calibri" w:cs="Calibri"/>
+              </w:rPr>
+              <w:t xml:space="preserve"> white)</w:t>
             </w:r>
           </w:p>
         </w:tc>
@@ -12049,11 +12278,19 @@
                 <w:rFonts w:ascii="Calibri" w:hAnsi="Calibri" w:cs="Calibri"/>
               </w:rPr>
             </w:pPr>
-            <w:r>
-              <w:rPr>
-                <w:rFonts w:ascii="Calibri" w:hAnsi="Calibri" w:cs="Calibri"/>
-              </w:rPr>
-              <w:t>Polituff (Body filler) w/ hardener</w:t>
+            <w:proofErr w:type="spellStart"/>
+            <w:r>
+              <w:rPr>
+                <w:rFonts w:ascii="Calibri" w:hAnsi="Calibri" w:cs="Calibri"/>
+              </w:rPr>
+              <w:t>Polituff</w:t>
+            </w:r>
+            <w:proofErr w:type="spellEnd"/>
+            <w:r>
+              <w:rPr>
+                <w:rFonts w:ascii="Calibri" w:hAnsi="Calibri" w:cs="Calibri"/>
+              </w:rPr>
+              <w:t xml:space="preserve"> (Body filler) w/ hardener</w:t>
             </w:r>
           </w:p>
         </w:tc>
@@ -12201,7 +12438,21 @@
               <w:rPr>
                 <w:rFonts w:ascii="Calibri" w:hAnsi="Calibri" w:cs="Calibri"/>
               </w:rPr>
-              <w:t>Quick Dry Enamel ( white )</w:t>
+              <w:t xml:space="preserve">Quick Dry Enamel </w:t>
+            </w:r>
+            <w:proofErr w:type="gramStart"/>
+            <w:r>
+              <w:rPr>
+                <w:rFonts w:ascii="Calibri" w:hAnsi="Calibri" w:cs="Calibri"/>
+              </w:rPr>
+              <w:t>( white</w:t>
+            </w:r>
+            <w:proofErr w:type="gramEnd"/>
+            <w:r>
+              <w:rPr>
+                <w:rFonts w:ascii="Calibri" w:hAnsi="Calibri" w:cs="Calibri"/>
+              </w:rPr>
+              <w:t xml:space="preserve"> )</w:t>
             </w:r>
           </w:p>
         </w:tc>
@@ -14082,8 +14333,30 @@
               <w:rPr>
                 <w:rFonts w:ascii="Calibri" w:hAnsi="Calibri" w:cs="Calibri"/>
               </w:rPr>
-              <w:t>Hose ½" Ø ( 90 meters/roll )</w:t>
-            </w:r>
+              <w:t xml:space="preserve">Hose ½" Ø </w:t>
+            </w:r>
+            <w:proofErr w:type="gramStart"/>
+            <w:r>
+              <w:rPr>
+                <w:rFonts w:ascii="Calibri" w:hAnsi="Calibri" w:cs="Calibri"/>
+              </w:rPr>
+              <w:t>( 90</w:t>
+            </w:r>
+            <w:proofErr w:type="gramEnd"/>
+            <w:r>
+              <w:rPr>
+                <w:rFonts w:ascii="Calibri" w:hAnsi="Calibri" w:cs="Calibri"/>
+              </w:rPr>
+              <w:t xml:space="preserve"> meters/</w:t>
+            </w:r>
+            <w:proofErr w:type="gramStart"/>
+            <w:r>
+              <w:rPr>
+                <w:rFonts w:ascii="Calibri" w:hAnsi="Calibri" w:cs="Calibri"/>
+              </w:rPr>
+              <w:t>roll )</w:t>
+            </w:r>
+            <w:proofErr w:type="gramEnd"/>
           </w:p>
         </w:tc>
         <w:tc>
@@ -15261,7 +15534,25 @@
                 <w:sz w:val="22"/>
                 <w:szCs w:val="22"/>
               </w:rPr>
-              <w:t>Strong Rubberized Water Proof Tape 4"x 5ft, flex tape</w:t>
+              <w:t xml:space="preserve">Strong Rubberized </w:t>
+            </w:r>
+            <w:proofErr w:type="gramStart"/>
+            <w:r>
+              <w:rPr>
+                <w:rFonts w:ascii="Calibri" w:hAnsi="Calibri" w:cs="Calibri"/>
+                <w:sz w:val="22"/>
+                <w:szCs w:val="22"/>
+              </w:rPr>
+              <w:t>Water Proof</w:t>
+            </w:r>
+            <w:proofErr w:type="gramEnd"/>
+            <w:r>
+              <w:rPr>
+                <w:rFonts w:ascii="Calibri" w:hAnsi="Calibri" w:cs="Calibri"/>
+                <w:sz w:val="22"/>
+                <w:szCs w:val="22"/>
+              </w:rPr>
+              <w:t xml:space="preserve"> Tape 4"x 5ft, flex tape</w:t>
             </w:r>
           </w:p>
         </w:tc>
@@ -15701,11 +15992,19 @@
                 <w:rFonts w:ascii="Calibri" w:hAnsi="Calibri" w:cs="Calibri"/>
               </w:rPr>
             </w:pPr>
-            <w:r>
-              <w:rPr>
-                <w:rFonts w:ascii="Calibri" w:hAnsi="Calibri" w:cs="Calibri"/>
-              </w:rPr>
-              <w:t>Teflon  tape ¾</w:t>
+            <w:proofErr w:type="gramStart"/>
+            <w:r>
+              <w:rPr>
+                <w:rFonts w:ascii="Calibri" w:hAnsi="Calibri" w:cs="Calibri"/>
+              </w:rPr>
+              <w:t>Teflon  tape</w:t>
+            </w:r>
+            <w:proofErr w:type="gramEnd"/>
+            <w:r>
+              <w:rPr>
+                <w:rFonts w:ascii="Calibri" w:hAnsi="Calibri" w:cs="Calibri"/>
+              </w:rPr>
+              <w:t xml:space="preserve"> ¾</w:t>
             </w:r>
           </w:p>
         </w:tc>
@@ -17234,11 +17533,19 @@
                 <w:rFonts w:ascii="Calibri" w:hAnsi="Calibri" w:cs="Calibri"/>
               </w:rPr>
             </w:pPr>
-            <w:r>
-              <w:rPr>
-                <w:rFonts w:ascii="Calibri" w:hAnsi="Calibri" w:cs="Calibri"/>
-              </w:rPr>
-              <w:t>Flatcord # 16</w:t>
+            <w:proofErr w:type="spellStart"/>
+            <w:r>
+              <w:rPr>
+                <w:rFonts w:ascii="Calibri" w:hAnsi="Calibri" w:cs="Calibri"/>
+              </w:rPr>
+              <w:t>Flatcord</w:t>
+            </w:r>
+            <w:proofErr w:type="spellEnd"/>
+            <w:r>
+              <w:rPr>
+                <w:rFonts w:ascii="Calibri" w:hAnsi="Calibri" w:cs="Calibri"/>
+              </w:rPr>
+              <w:t xml:space="preserve"> # 16</w:t>
             </w:r>
           </w:p>
         </w:tc>
@@ -17361,11 +17668,19 @@
                 <w:rFonts w:ascii="Calibri" w:hAnsi="Calibri" w:cs="Calibri"/>
               </w:rPr>
             </w:pPr>
-            <w:r>
-              <w:rPr>
-                <w:rFonts w:ascii="Calibri" w:hAnsi="Calibri" w:cs="Calibri"/>
-              </w:rPr>
-              <w:t>Flourescent tube bulb 15 watts LED</w:t>
+            <w:proofErr w:type="spellStart"/>
+            <w:r>
+              <w:rPr>
+                <w:rFonts w:ascii="Calibri" w:hAnsi="Calibri" w:cs="Calibri"/>
+              </w:rPr>
+              <w:t>Flourescent</w:t>
+            </w:r>
+            <w:proofErr w:type="spellEnd"/>
+            <w:r>
+              <w:rPr>
+                <w:rFonts w:ascii="Calibri" w:hAnsi="Calibri" w:cs="Calibri"/>
+              </w:rPr>
+              <w:t xml:space="preserve"> tube bulb 15 watts LED</w:t>
             </w:r>
           </w:p>
         </w:tc>
@@ -17893,7 +18208,21 @@
               <w:rPr>
                 <w:rFonts w:ascii="Calibri" w:hAnsi="Calibri" w:cs="Calibri"/>
               </w:rPr>
-              <w:t xml:space="preserve">LED Bulb 10 watts ( daylight )          </w:t>
+              <w:t xml:space="preserve">LED Bulb 10 watts </w:t>
+            </w:r>
+            <w:proofErr w:type="gramStart"/>
+            <w:r>
+              <w:rPr>
+                <w:rFonts w:ascii="Calibri" w:hAnsi="Calibri" w:cs="Calibri"/>
+              </w:rPr>
+              <w:t>( daylight</w:t>
+            </w:r>
+            <w:proofErr w:type="gramEnd"/>
+            <w:r>
+              <w:rPr>
+                <w:rFonts w:ascii="Calibri" w:hAnsi="Calibri" w:cs="Calibri"/>
+              </w:rPr>
+              <w:t xml:space="preserve"> )          </w:t>
             </w:r>
           </w:p>
         </w:tc>
@@ -18558,7 +18887,21 @@
               <w:rPr>
                 <w:rFonts w:ascii="Calibri" w:hAnsi="Calibri" w:cs="Calibri"/>
               </w:rPr>
-              <w:t>PVC Moulding 1</w:t>
+              <w:t xml:space="preserve">PVC </w:t>
+            </w:r>
+            <w:proofErr w:type="spellStart"/>
+            <w:r>
+              <w:rPr>
+                <w:rFonts w:ascii="Calibri" w:hAnsi="Calibri" w:cs="Calibri"/>
+              </w:rPr>
+              <w:t>Moulding</w:t>
+            </w:r>
+            <w:proofErr w:type="spellEnd"/>
+            <w:r>
+              <w:rPr>
+                <w:rFonts w:ascii="Calibri" w:hAnsi="Calibri" w:cs="Calibri"/>
+              </w:rPr>
+              <w:t xml:space="preserve"> 1</w:t>
             </w:r>
           </w:p>
         </w:tc>
@@ -18691,7 +19034,21 @@
               <w:rPr>
                 <w:rFonts w:ascii="Calibri" w:hAnsi="Calibri" w:cs="Calibri"/>
               </w:rPr>
-              <w:t>PVC Moulding ¾</w:t>
+              <w:t xml:space="preserve">PVC </w:t>
+            </w:r>
+            <w:proofErr w:type="spellStart"/>
+            <w:r>
+              <w:rPr>
+                <w:rFonts w:ascii="Calibri" w:hAnsi="Calibri" w:cs="Calibri"/>
+              </w:rPr>
+              <w:t>Moulding</w:t>
+            </w:r>
+            <w:proofErr w:type="spellEnd"/>
+            <w:r>
+              <w:rPr>
+                <w:rFonts w:ascii="Calibri" w:hAnsi="Calibri" w:cs="Calibri"/>
+              </w:rPr>
+              <w:t xml:space="preserve"> ¾</w:t>
             </w:r>
           </w:p>
         </w:tc>
@@ -18824,7 +19181,35 @@
               <w:rPr>
                 <w:rFonts w:ascii="Calibri" w:hAnsi="Calibri" w:cs="Calibri"/>
               </w:rPr>
-              <w:t>Rubber Plug ( heavy Duty ) (24pcs/box)</w:t>
+              <w:t xml:space="preserve">Rubber Plug </w:t>
+            </w:r>
+            <w:proofErr w:type="gramStart"/>
+            <w:r>
+              <w:rPr>
+                <w:rFonts w:ascii="Calibri" w:hAnsi="Calibri" w:cs="Calibri"/>
+              </w:rPr>
+              <w:t>( heavy</w:t>
+            </w:r>
+            <w:proofErr w:type="gramEnd"/>
+            <w:r>
+              <w:rPr>
+                <w:rFonts w:ascii="Calibri" w:hAnsi="Calibri" w:cs="Calibri"/>
+              </w:rPr>
+              <w:t xml:space="preserve"> </w:t>
+            </w:r>
+            <w:proofErr w:type="gramStart"/>
+            <w:r>
+              <w:rPr>
+                <w:rFonts w:ascii="Calibri" w:hAnsi="Calibri" w:cs="Calibri"/>
+              </w:rPr>
+              <w:t>Duty )</w:t>
+            </w:r>
+            <w:proofErr w:type="gramEnd"/>
+            <w:r>
+              <w:rPr>
+                <w:rFonts w:ascii="Calibri" w:hAnsi="Calibri" w:cs="Calibri"/>
+              </w:rPr>
+              <w:t xml:space="preserve"> (24pcs/box)</w:t>
             </w:r>
           </w:p>
         </w:tc>
@@ -21356,7 +21741,21 @@
               <w:rPr>
                 <w:rFonts w:ascii="Calibri" w:hAnsi="Calibri" w:cs="Calibri"/>
               </w:rPr>
-              <w:t>") x 30m (100ft) -double jacketed with rubber lining; 300 Psi wp;  900Psi bp</w:t>
+              <w:t xml:space="preserve">") x 30m (100ft) -double jacketed with rubber lining; 300 Psi </w:t>
+            </w:r>
+            <w:proofErr w:type="gramStart"/>
+            <w:r>
+              <w:rPr>
+                <w:rFonts w:ascii="Calibri" w:hAnsi="Calibri" w:cs="Calibri"/>
+              </w:rPr>
+              <w:t>wp;  900</w:t>
+            </w:r>
+            <w:proofErr w:type="gramEnd"/>
+            <w:r>
+              <w:rPr>
+                <w:rFonts w:ascii="Calibri" w:hAnsi="Calibri" w:cs="Calibri"/>
+              </w:rPr>
+              <w:t>Psi bp</w:t>
             </w:r>
           </w:p>
         </w:tc>
@@ -21489,8 +21888,16 @@
               <w:rPr>
                 <w:rFonts w:ascii="Calibri" w:hAnsi="Calibri" w:cs="Calibri"/>
               </w:rPr>
-              <w:t>Fire hose 1.5" x 50ft. With brass coupling double jacketed, NST (NH) Gaspang</w:t>
-            </w:r>
+              <w:t xml:space="preserve">Fire hose 1.5" x 50ft. With brass coupling double jacketed, NST (NH) </w:t>
+            </w:r>
+            <w:proofErr w:type="spellStart"/>
+            <w:r>
+              <w:rPr>
+                <w:rFonts w:ascii="Calibri" w:hAnsi="Calibri" w:cs="Calibri"/>
+              </w:rPr>
+              <w:t>Gaspang</w:t>
+            </w:r>
+            <w:proofErr w:type="spellEnd"/>
           </w:p>
         </w:tc>
         <w:tc>
@@ -22310,6 +22717,7 @@
                 <w:rFonts w:ascii="Calibri" w:hAnsi="Calibri" w:cs="Calibri"/>
               </w:rPr>
             </w:pPr>
+            <w:proofErr w:type="gramStart"/>
             <w:r>
               <w:rPr>
                 <w:rFonts w:ascii="Calibri" w:hAnsi="Calibri" w:cs="Calibri"/>
@@ -22317,6 +22725,7 @@
               </w:rPr>
               <w:t>20  pieces</w:t>
             </w:r>
+            <w:proofErr w:type="gramEnd"/>
           </w:p>
         </w:tc>
         <w:tc>
@@ -24400,11 +24809,19 @@
                 <w:rFonts w:ascii="Calibri" w:hAnsi="Calibri" w:cs="Calibri"/>
               </w:rPr>
             </w:pPr>
-            <w:r>
-              <w:rPr>
-                <w:rFonts w:ascii="Calibri" w:hAnsi="Calibri" w:cs="Calibri"/>
-              </w:rPr>
-              <w:t>Trashbag medium 25pcs/roll black</w:t>
+            <w:proofErr w:type="spellStart"/>
+            <w:r>
+              <w:rPr>
+                <w:rFonts w:ascii="Calibri" w:hAnsi="Calibri" w:cs="Calibri"/>
+              </w:rPr>
+              <w:t>Trashbag</w:t>
+            </w:r>
+            <w:proofErr w:type="spellEnd"/>
+            <w:r>
+              <w:rPr>
+                <w:rFonts w:ascii="Calibri" w:hAnsi="Calibri" w:cs="Calibri"/>
+              </w:rPr>
+              <w:t xml:space="preserve"> medium 25pcs/roll black</w:t>
             </w:r>
           </w:p>
         </w:tc>
@@ -24537,7 +24954,21 @@
               <w:rPr>
                 <w:rFonts w:ascii="Calibri" w:hAnsi="Calibri" w:cs="Calibri"/>
               </w:rPr>
-              <w:t>Seal it bag 84x120x0.04mm</w:t>
+              <w:t xml:space="preserve">Seal it </w:t>
+            </w:r>
+            <w:proofErr w:type="gramStart"/>
+            <w:r>
+              <w:rPr>
+                <w:rFonts w:ascii="Calibri" w:hAnsi="Calibri" w:cs="Calibri"/>
+              </w:rPr>
+              <w:t>bag</w:t>
+            </w:r>
+            <w:proofErr w:type="gramEnd"/>
+            <w:r>
+              <w:rPr>
+                <w:rFonts w:ascii="Calibri" w:hAnsi="Calibri" w:cs="Calibri"/>
+              </w:rPr>
+              <w:t xml:space="preserve"> 84x120x0.04mm</w:t>
             </w:r>
           </w:p>
         </w:tc>
@@ -27578,7 +28009,21 @@
               <w:rPr>
                 <w:rFonts w:ascii="Calibri" w:hAnsi="Calibri" w:cs="Calibri"/>
               </w:rPr>
-              <w:t>Walis Pang-agiw (Heavy duty)</w:t>
+              <w:t>Walis Pang-</w:t>
+            </w:r>
+            <w:proofErr w:type="spellStart"/>
+            <w:r>
+              <w:rPr>
+                <w:rFonts w:ascii="Calibri" w:hAnsi="Calibri" w:cs="Calibri"/>
+              </w:rPr>
+              <w:t>agiw</w:t>
+            </w:r>
+            <w:proofErr w:type="spellEnd"/>
+            <w:r>
+              <w:rPr>
+                <w:rFonts w:ascii="Calibri" w:hAnsi="Calibri" w:cs="Calibri"/>
+              </w:rPr>
+              <w:t xml:space="preserve"> (Heavy duty)</w:t>
             </w:r>
           </w:p>
         </w:tc>
@@ -27711,7 +28156,35 @@
               <w:rPr>
                 <w:rFonts w:ascii="Calibri" w:hAnsi="Calibri" w:cs="Calibri"/>
               </w:rPr>
-              <w:t>Walis tingting (kaong)</w:t>
+              <w:t xml:space="preserve">Walis </w:t>
+            </w:r>
+            <w:proofErr w:type="spellStart"/>
+            <w:r>
+              <w:rPr>
+                <w:rFonts w:ascii="Calibri" w:hAnsi="Calibri" w:cs="Calibri"/>
+              </w:rPr>
+              <w:t>tingting</w:t>
+            </w:r>
+            <w:proofErr w:type="spellEnd"/>
+            <w:r>
+              <w:rPr>
+                <w:rFonts w:ascii="Calibri" w:hAnsi="Calibri" w:cs="Calibri"/>
+              </w:rPr>
+              <w:t xml:space="preserve"> (</w:t>
+            </w:r>
+            <w:proofErr w:type="spellStart"/>
+            <w:r>
+              <w:rPr>
+                <w:rFonts w:ascii="Calibri" w:hAnsi="Calibri" w:cs="Calibri"/>
+              </w:rPr>
+              <w:t>kaong</w:t>
+            </w:r>
+            <w:proofErr w:type="spellEnd"/>
+            <w:r>
+              <w:rPr>
+                <w:rFonts w:ascii="Calibri" w:hAnsi="Calibri" w:cs="Calibri"/>
+              </w:rPr>
+              <w:t>)</w:t>
             </w:r>
           </w:p>
         </w:tc>
@@ -28227,7 +28700,25 @@
                 <w:sz w:val="22"/>
                 <w:szCs w:val="22"/>
               </w:rPr>
-              <w:t>5-1 Digester - Water Digester ; Odor Eliminator; Mosquito Repellant; Flies Control; Disinfectant/Deodorizer</w:t>
+              <w:t xml:space="preserve">5-1 Digester - Water </w:t>
+            </w:r>
+            <w:proofErr w:type="gramStart"/>
+            <w:r>
+              <w:rPr>
+                <w:rFonts w:ascii="Calibri" w:hAnsi="Calibri" w:cs="Calibri"/>
+                <w:sz w:val="22"/>
+                <w:szCs w:val="22"/>
+              </w:rPr>
+              <w:t>Digester ;</w:t>
+            </w:r>
+            <w:proofErr w:type="gramEnd"/>
+            <w:r>
+              <w:rPr>
+                <w:rFonts w:ascii="Calibri" w:hAnsi="Calibri" w:cs="Calibri"/>
+                <w:sz w:val="22"/>
+                <w:szCs w:val="22"/>
+              </w:rPr>
+              <w:t xml:space="preserve"> Odor Eliminator; Mosquito Repellant; Flies Control; Disinfectant/Deodorizer</w:t>
             </w:r>
           </w:p>
         </w:tc>
@@ -29738,7 +30229,23 @@
           <w:rFonts w:asciiTheme="minorHAnsi" w:hAnsiTheme="minorHAnsi" w:cstheme="minorHAnsi"/>
           <w:b/>
         </w:rPr>
-        <w:t>Reviewed and found to be accordance with the A</w:t>
+        <w:t xml:space="preserve">Reviewed and found to </w:t>
+      </w:r>
+      <w:proofErr w:type="gramStart"/>
+      <w:r>
+        <w:rPr>
+          <w:rFonts w:asciiTheme="minorHAnsi" w:hAnsiTheme="minorHAnsi" w:cstheme="minorHAnsi"/>
+          <w:b/>
+        </w:rPr>
+        <w:t>be</w:t>
+      </w:r>
+      <w:proofErr w:type="gramEnd"/>
+      <w:r>
+        <w:rPr>
+          <w:rFonts w:asciiTheme="minorHAnsi" w:hAnsiTheme="minorHAnsi" w:cstheme="minorHAnsi"/>
+          <w:b/>
+        </w:rPr>
+        <w:t xml:space="preserve"> accordance with the A</w:t>
       </w:r>
       <w:r>
         <w:rPr>
@@ -30478,7 +30985,6 @@
         <w:docPartUnique/>
       </w:docPartObj>
     </w:sdtPr>
-    <w:sdtEndPr/>
     <w:sdtContent>
       <w:p>
         <w:pPr>
@@ -30531,7 +31037,6 @@
         <w:docPartUnique/>
       </w:docPartObj>
     </w:sdtPr>
-    <w:sdtEndPr/>
     <w:sdtContent>
       <w:p>
         <w:pPr>
@@ -33397,7 +33902,6 @@
 <ds:datastoreItem xmlns:ds="http://schemas.openxmlformats.org/officeDocument/2006/customXml" ds:itemID="{7066FEDD-55AD-4AA0-A16B-A310B59D155E}">
   <ds:schemaRefs>
     <ds:schemaRef ds:uri="http://schemas.openxmlformats.org/officeDocument/2006/bibliography"/>
-    <ds:schemaRef ds:uri="http://www.w3.org/2000/xmlns/"/>
   </ds:schemaRefs>
 </ds:datastoreItem>
 </file>
</xml_diff>

<commit_message>
finished work program comparison feature
</commit_message>
<xml_diff>
--- a/docs/5. work-program-template.docx
+++ b/docs/5. work-program-template.docx
@@ -412,21 +412,7 @@
         <w:rPr>
           <w:rFonts w:asciiTheme="minorHAnsi" w:hAnsiTheme="minorHAnsi" w:cstheme="minorHAnsi"/>
         </w:rPr>
-        <w:t xml:space="preserve"> office is committed to </w:t>
-      </w:r>
-      <w:proofErr w:type="gramStart"/>
-      <w:r>
-        <w:rPr>
-          <w:rFonts w:asciiTheme="minorHAnsi" w:hAnsiTheme="minorHAnsi" w:cstheme="minorHAnsi"/>
-        </w:rPr>
-        <w:t>provide</w:t>
-      </w:r>
-      <w:proofErr w:type="gramEnd"/>
-      <w:r>
-        <w:rPr>
-          <w:rFonts w:asciiTheme="minorHAnsi" w:hAnsiTheme="minorHAnsi" w:cstheme="minorHAnsi"/>
-        </w:rPr>
-        <w:t xml:space="preserve"> conducive </w:t>
+        <w:t xml:space="preserve"> office is committed to provide conducive </w:t>
       </w:r>
       <w:r>
         <w:rPr>
@@ -1769,19 +1755,11 @@
                 <w:rFonts w:ascii="Calibri" w:hAnsi="Calibri" w:cs="Calibri"/>
               </w:rPr>
             </w:pPr>
-            <w:proofErr w:type="spellStart"/>
-            <w:r>
-              <w:rPr>
-                <w:rFonts w:ascii="Calibri" w:hAnsi="Calibri" w:cs="Calibri"/>
-              </w:rPr>
-              <w:t>Blackscrew</w:t>
-            </w:r>
-            <w:proofErr w:type="spellEnd"/>
-            <w:r>
-              <w:rPr>
-                <w:rFonts w:ascii="Calibri" w:hAnsi="Calibri" w:cs="Calibri"/>
-              </w:rPr>
-              <w:t xml:space="preserve"> #1 (for metal)</w:t>
+            <w:r>
+              <w:rPr>
+                <w:rFonts w:ascii="Calibri" w:hAnsi="Calibri" w:cs="Calibri"/>
+              </w:rPr>
+              <w:t>Blackscrew #1 (for metal)</w:t>
             </w:r>
           </w:p>
         </w:tc>
@@ -1914,19 +1892,11 @@
                 <w:rFonts w:ascii="Calibri" w:hAnsi="Calibri" w:cs="Calibri"/>
               </w:rPr>
             </w:pPr>
-            <w:proofErr w:type="spellStart"/>
-            <w:r>
-              <w:rPr>
-                <w:rFonts w:ascii="Calibri" w:hAnsi="Calibri" w:cs="Calibri"/>
-              </w:rPr>
-              <w:t>Blackscrew</w:t>
-            </w:r>
-            <w:proofErr w:type="spellEnd"/>
-            <w:r>
-              <w:rPr>
-                <w:rFonts w:ascii="Calibri" w:hAnsi="Calibri" w:cs="Calibri"/>
-              </w:rPr>
-              <w:t xml:space="preserve"> #1-½ (for wood)</w:t>
+            <w:r>
+              <w:rPr>
+                <w:rFonts w:ascii="Calibri" w:hAnsi="Calibri" w:cs="Calibri"/>
+              </w:rPr>
+              <w:t>Blackscrew #1-½ (for wood)</w:t>
             </w:r>
           </w:p>
         </w:tc>
@@ -2052,19 +2022,11 @@
                 <w:rFonts w:ascii="Calibri" w:hAnsi="Calibri" w:cs="Calibri"/>
               </w:rPr>
             </w:pPr>
-            <w:proofErr w:type="spellStart"/>
-            <w:r>
-              <w:rPr>
-                <w:rFonts w:ascii="Calibri" w:hAnsi="Calibri" w:cs="Calibri"/>
-              </w:rPr>
-              <w:t>Blackscrew</w:t>
-            </w:r>
-            <w:proofErr w:type="spellEnd"/>
-            <w:r>
-              <w:rPr>
-                <w:rFonts w:ascii="Calibri" w:hAnsi="Calibri" w:cs="Calibri"/>
-              </w:rPr>
-              <w:t xml:space="preserve"> #1-½ (metal)</w:t>
+            <w:r>
+              <w:rPr>
+                <w:rFonts w:ascii="Calibri" w:hAnsi="Calibri" w:cs="Calibri"/>
+              </w:rPr>
+              <w:t>Blackscrew #1-½ (metal)</w:t>
             </w:r>
           </w:p>
         </w:tc>
@@ -2190,19 +2152,11 @@
                 <w:rFonts w:ascii="Calibri" w:hAnsi="Calibri" w:cs="Calibri"/>
               </w:rPr>
             </w:pPr>
-            <w:proofErr w:type="spellStart"/>
-            <w:r>
-              <w:rPr>
-                <w:rFonts w:ascii="Calibri" w:hAnsi="Calibri" w:cs="Calibri"/>
-              </w:rPr>
-              <w:t>Blackscrew</w:t>
-            </w:r>
-            <w:proofErr w:type="spellEnd"/>
-            <w:r>
-              <w:rPr>
-                <w:rFonts w:ascii="Calibri" w:hAnsi="Calibri" w:cs="Calibri"/>
-              </w:rPr>
-              <w:t xml:space="preserve"> #2-½ (for wood)</w:t>
+            <w:r>
+              <w:rPr>
+                <w:rFonts w:ascii="Calibri" w:hAnsi="Calibri" w:cs="Calibri"/>
+              </w:rPr>
+              <w:t>Blackscrew #2-½ (for wood)</w:t>
             </w:r>
           </w:p>
         </w:tc>
@@ -2328,19 +2282,11 @@
                 <w:rFonts w:ascii="Calibri" w:hAnsi="Calibri" w:cs="Calibri"/>
               </w:rPr>
             </w:pPr>
-            <w:proofErr w:type="spellStart"/>
-            <w:r>
-              <w:rPr>
-                <w:rFonts w:ascii="Calibri" w:hAnsi="Calibri" w:cs="Calibri"/>
-              </w:rPr>
-              <w:t>Blackscrew</w:t>
-            </w:r>
-            <w:proofErr w:type="spellEnd"/>
-            <w:r>
-              <w:rPr>
-                <w:rFonts w:ascii="Calibri" w:hAnsi="Calibri" w:cs="Calibri"/>
-              </w:rPr>
-              <w:t xml:space="preserve"> #2-½ (for metal)</w:t>
+            <w:r>
+              <w:rPr>
+                <w:rFonts w:ascii="Calibri" w:hAnsi="Calibri" w:cs="Calibri"/>
+              </w:rPr>
+              <w:t>Blackscrew #2-½ (for metal)</w:t>
             </w:r>
           </w:p>
         </w:tc>
@@ -3456,13 +3402,7 @@
               <w:rPr>
                 <w:rFonts w:ascii="Calibri" w:hAnsi="Calibri" w:cs="Calibri"/>
               </w:rPr>
-              <w:t>CWN # 1-</w:t>
-            </w:r>
-            <w:r>
-              <w:rPr>
-                <w:rFonts w:ascii="Calibri" w:hAnsi="Calibri" w:cs="Calibri"/>
-              </w:rPr>
-              <w:t>½</w:t>
+              <w:t>Tshirt with collar and print premium dry fit</w:t>
             </w:r>
           </w:p>
         </w:tc>
@@ -3488,7 +3428,7 @@
               <w:rPr>
                 <w:rFonts w:ascii="Calibri" w:hAnsi="Calibri" w:cs="Calibri"/>
               </w:rPr>
-              <w:t>5</w:t>
+              <w:t>80</w:t>
             </w:r>
             <w:r>
               <w:rPr>
@@ -3500,7 +3440,7 @@
               <w:rPr>
                 <w:rFonts w:ascii="Calibri" w:hAnsi="Calibri" w:cs="Calibri"/>
               </w:rPr>
-              <w:t>kilos</w:t>
+              <w:t>pieces</w:t>
             </w:r>
           </w:p>
         </w:tc>
@@ -4162,33 +4102,11 @@
                 <w:rFonts w:ascii="Calibri" w:hAnsi="Calibri" w:cs="Calibri"/>
               </w:rPr>
             </w:pPr>
-            <w:proofErr w:type="gramStart"/>
-            <w:r>
-              <w:rPr>
-                <w:rFonts w:ascii="Calibri" w:hAnsi="Calibri" w:cs="Calibri"/>
-              </w:rPr>
-              <w:t>Door Knob</w:t>
-            </w:r>
-            <w:proofErr w:type="gramEnd"/>
-            <w:r>
-              <w:rPr>
-                <w:rFonts w:ascii="Calibri" w:hAnsi="Calibri" w:cs="Calibri"/>
-              </w:rPr>
-              <w:t xml:space="preserve"> </w:t>
-            </w:r>
-            <w:proofErr w:type="gramStart"/>
-            <w:r>
-              <w:rPr>
-                <w:rFonts w:ascii="Calibri" w:hAnsi="Calibri" w:cs="Calibri"/>
-              </w:rPr>
-              <w:t>( heavy</w:t>
-            </w:r>
-            <w:proofErr w:type="gramEnd"/>
-            <w:r>
-              <w:rPr>
-                <w:rFonts w:ascii="Calibri" w:hAnsi="Calibri" w:cs="Calibri"/>
-              </w:rPr>
-              <w:t xml:space="preserve"> duty)</w:t>
+            <w:r>
+              <w:rPr>
+                <w:rFonts w:ascii="Calibri" w:hAnsi="Calibri" w:cs="Calibri"/>
+              </w:rPr>
+              <w:t>Door Knob ( heavy duty)</w:t>
             </w:r>
           </w:p>
         </w:tc>
@@ -6043,21 +5961,7 @@
               <w:rPr>
                 <w:rFonts w:ascii="Calibri" w:hAnsi="Calibri" w:cs="Calibri"/>
               </w:rPr>
-              <w:t xml:space="preserve">Padlock 50 </w:t>
-            </w:r>
-            <w:proofErr w:type="gramStart"/>
-            <w:r>
-              <w:rPr>
-                <w:rFonts w:ascii="Calibri" w:hAnsi="Calibri" w:cs="Calibri"/>
-              </w:rPr>
-              <w:t>mm  (</w:t>
-            </w:r>
-            <w:proofErr w:type="gramEnd"/>
-            <w:r>
-              <w:rPr>
-                <w:rFonts w:ascii="Calibri" w:hAnsi="Calibri" w:cs="Calibri"/>
-              </w:rPr>
-              <w:t>heavy duty)</w:t>
+              <w:t>Padlock 50 mm  (heavy duty)</w:t>
             </w:r>
           </w:p>
         </w:tc>
@@ -6617,21 +6521,7 @@
               <w:rPr>
                 <w:rFonts w:ascii="Calibri" w:hAnsi="Calibri" w:cs="Calibri"/>
               </w:rPr>
-              <w:t xml:space="preserve">½" x 1" x 8' </w:t>
-            </w:r>
-            <w:proofErr w:type="spellStart"/>
-            <w:r>
-              <w:rPr>
-                <w:rFonts w:ascii="Calibri" w:hAnsi="Calibri" w:cs="Calibri"/>
-              </w:rPr>
-              <w:t>liston</w:t>
-            </w:r>
-            <w:proofErr w:type="spellEnd"/>
-            <w:r>
-              <w:rPr>
-                <w:rFonts w:ascii="Calibri" w:hAnsi="Calibri" w:cs="Calibri"/>
-              </w:rPr>
-              <w:t xml:space="preserve"> (K.D.</w:t>
+              <w:t>½" x 1" x 8' liston (K.D.</w:t>
             </w:r>
             <w:r>
               <w:rPr>
@@ -6776,16 +6666,8 @@
               <w:rPr>
                 <w:rFonts w:ascii="Calibri" w:hAnsi="Calibri" w:cs="Calibri"/>
               </w:rPr>
-              <w:t xml:space="preserve">½" x 2" x 8' </w:t>
-            </w:r>
-            <w:proofErr w:type="spellStart"/>
-            <w:r>
-              <w:rPr>
-                <w:rFonts w:ascii="Calibri" w:hAnsi="Calibri" w:cs="Calibri"/>
-              </w:rPr>
-              <w:t>liston</w:t>
-            </w:r>
-            <w:proofErr w:type="spellEnd"/>
+              <w:t>½" x 2" x 8' liston</w:t>
+            </w:r>
           </w:p>
         </w:tc>
         <w:tc>
@@ -7328,21 +7210,7 @@
               <w:rPr>
                 <w:rFonts w:ascii="Calibri" w:hAnsi="Calibri" w:cs="Calibri"/>
               </w:rPr>
-              <w:t xml:space="preserve">2" x 2" x 8' Good Lumber </w:t>
-            </w:r>
-            <w:proofErr w:type="gramStart"/>
-            <w:r>
-              <w:rPr>
-                <w:rFonts w:ascii="Calibri" w:hAnsi="Calibri" w:cs="Calibri"/>
-              </w:rPr>
-              <w:t>( Tanguile</w:t>
-            </w:r>
-            <w:proofErr w:type="gramEnd"/>
-            <w:r>
-              <w:rPr>
-                <w:rFonts w:ascii="Calibri" w:hAnsi="Calibri" w:cs="Calibri"/>
-              </w:rPr>
-              <w:t xml:space="preserve"> ) S4S</w:t>
+              <w:t>2" x 2" x 8' Good Lumber ( Tanguile ) S4S</w:t>
             </w:r>
           </w:p>
         </w:tc>
@@ -7481,21 +7349,7 @@
               <w:rPr>
                 <w:rFonts w:ascii="Calibri" w:hAnsi="Calibri" w:cs="Calibri"/>
               </w:rPr>
-              <w:t xml:space="preserve">2" x 2" x 10' Good Lumber </w:t>
-            </w:r>
-            <w:proofErr w:type="gramStart"/>
-            <w:r>
-              <w:rPr>
-                <w:rFonts w:ascii="Calibri" w:hAnsi="Calibri" w:cs="Calibri"/>
-              </w:rPr>
-              <w:t>( Tanguile</w:t>
-            </w:r>
-            <w:proofErr w:type="gramEnd"/>
-            <w:r>
-              <w:rPr>
-                <w:rFonts w:ascii="Calibri" w:hAnsi="Calibri" w:cs="Calibri"/>
-              </w:rPr>
-              <w:t xml:space="preserve"> ) S4S</w:t>
+              <w:t>2" x 2" x 10' Good Lumber ( Tanguile ) S4S</w:t>
             </w:r>
           </w:p>
         </w:tc>
@@ -7909,21 +7763,7 @@
               <w:rPr>
                 <w:rFonts w:ascii="Calibri" w:hAnsi="Calibri" w:cs="Calibri"/>
               </w:rPr>
-              <w:t xml:space="preserve">2" x 3" x 10' Good Lumber </w:t>
-            </w:r>
-            <w:proofErr w:type="gramStart"/>
-            <w:r>
-              <w:rPr>
-                <w:rFonts w:ascii="Calibri" w:hAnsi="Calibri" w:cs="Calibri"/>
-              </w:rPr>
-              <w:t>( Tanguile</w:t>
-            </w:r>
-            <w:proofErr w:type="gramEnd"/>
-            <w:r>
-              <w:rPr>
-                <w:rFonts w:ascii="Calibri" w:hAnsi="Calibri" w:cs="Calibri"/>
-              </w:rPr>
-              <w:t xml:space="preserve"> ) S4S</w:t>
+              <w:t>2" x 3" x 10' Good Lumber ( Tanguile ) S4S</w:t>
             </w:r>
           </w:p>
         </w:tc>
@@ -8299,16 +8139,8 @@
               <w:rPr>
                 <w:rFonts w:ascii="Calibri" w:hAnsi="Calibri" w:cs="Calibri"/>
               </w:rPr>
-              <w:t xml:space="preserve">Angle bar 2" x 2" x ¼ </w:t>
-            </w:r>
-            <w:proofErr w:type="spellStart"/>
-            <w:r>
-              <w:rPr>
-                <w:rFonts w:ascii="Calibri" w:hAnsi="Calibri" w:cs="Calibri"/>
-              </w:rPr>
-              <w:t>thk</w:t>
-            </w:r>
-            <w:proofErr w:type="spellEnd"/>
+              <w:t>Angle bar 2" x 2" x ¼ thk</w:t>
+            </w:r>
           </w:p>
         </w:tc>
         <w:tc>
@@ -8479,16 +8311,8 @@
               <w:rPr>
                 <w:rFonts w:ascii="Calibri" w:hAnsi="Calibri" w:cs="Calibri"/>
               </w:rPr>
-              <w:t xml:space="preserve">" x ¼ </w:t>
-            </w:r>
-            <w:proofErr w:type="spellStart"/>
-            <w:r>
-              <w:rPr>
-                <w:rFonts w:ascii="Calibri" w:hAnsi="Calibri" w:cs="Calibri"/>
-              </w:rPr>
-              <w:t>thk</w:t>
-            </w:r>
-            <w:proofErr w:type="spellEnd"/>
+              <w:t>" x ¼ thk</w:t>
+            </w:r>
           </w:p>
         </w:tc>
         <w:tc>
@@ -8635,21 +8459,7 @@
               <w:rPr>
                 <w:rFonts w:ascii="Calibri" w:hAnsi="Calibri" w:cs="Calibri"/>
               </w:rPr>
-              <w:t xml:space="preserve">Angle bar 1 x 1 x ¼" </w:t>
-            </w:r>
-            <w:proofErr w:type="spellStart"/>
-            <w:r>
-              <w:rPr>
-                <w:rFonts w:ascii="Calibri" w:hAnsi="Calibri" w:cs="Calibri"/>
-              </w:rPr>
-              <w:t>thk</w:t>
-            </w:r>
-            <w:proofErr w:type="spellEnd"/>
-            <w:r>
-              <w:rPr>
-                <w:rFonts w:ascii="Calibri" w:hAnsi="Calibri" w:cs="Calibri"/>
-              </w:rPr>
-              <w:t xml:space="preserve"> </w:t>
+              <w:t xml:space="preserve">Angle bar 1 x 1 x ¼" thk </w:t>
             </w:r>
           </w:p>
         </w:tc>
@@ -10259,19 +10069,11 @@
                 <w:rFonts w:ascii="Calibri" w:hAnsi="Calibri" w:cs="Calibri"/>
               </w:rPr>
             </w:pPr>
-            <w:proofErr w:type="spellStart"/>
-            <w:r>
-              <w:rPr>
-                <w:rFonts w:ascii="Calibri" w:hAnsi="Calibri" w:cs="Calibri"/>
-              </w:rPr>
-              <w:t>Flatwall</w:t>
-            </w:r>
-            <w:proofErr w:type="spellEnd"/>
-            <w:r>
-              <w:rPr>
-                <w:rFonts w:ascii="Calibri" w:hAnsi="Calibri" w:cs="Calibri"/>
-              </w:rPr>
-              <w:t xml:space="preserve"> Enamel</w:t>
+            <w:r>
+              <w:rPr>
+                <w:rFonts w:ascii="Calibri" w:hAnsi="Calibri" w:cs="Calibri"/>
+              </w:rPr>
+              <w:t>Flatwall Enamel</w:t>
             </w:r>
           </w:p>
         </w:tc>
@@ -10419,21 +10221,7 @@
               <w:rPr>
                 <w:rFonts w:ascii="Calibri" w:hAnsi="Calibri" w:cs="Calibri"/>
               </w:rPr>
-              <w:t xml:space="preserve">Gloss Latex </w:t>
-            </w:r>
-            <w:proofErr w:type="gramStart"/>
-            <w:r>
-              <w:rPr>
-                <w:rFonts w:ascii="Calibri" w:hAnsi="Calibri" w:cs="Calibri"/>
-              </w:rPr>
-              <w:t>( white</w:t>
-            </w:r>
-            <w:proofErr w:type="gramEnd"/>
-            <w:r>
-              <w:rPr>
-                <w:rFonts w:ascii="Calibri" w:hAnsi="Calibri" w:cs="Calibri"/>
-              </w:rPr>
-              <w:t xml:space="preserve"> )</w:t>
+              <w:t>Gloss Latex ( white )</w:t>
             </w:r>
           </w:p>
         </w:tc>
@@ -10770,21 +10558,7 @@
               <w:rPr>
                 <w:rFonts w:ascii="Calibri" w:hAnsi="Calibri" w:cs="Calibri"/>
               </w:rPr>
-              <w:t>Latex Paint (</w:t>
-            </w:r>
-            <w:proofErr w:type="spellStart"/>
-            <w:r>
-              <w:rPr>
-                <w:rFonts w:ascii="Calibri" w:hAnsi="Calibri" w:cs="Calibri"/>
-              </w:rPr>
-              <w:t>Semi gloss</w:t>
-            </w:r>
-            <w:proofErr w:type="spellEnd"/>
-            <w:r>
-              <w:rPr>
-                <w:rFonts w:ascii="Calibri" w:hAnsi="Calibri" w:cs="Calibri"/>
-              </w:rPr>
-              <w:t xml:space="preserve"> white)</w:t>
+              <w:t>Latex Paint (Semi gloss white)</w:t>
             </w:r>
           </w:p>
         </w:tc>
@@ -12278,19 +12052,11 @@
                 <w:rFonts w:ascii="Calibri" w:hAnsi="Calibri" w:cs="Calibri"/>
               </w:rPr>
             </w:pPr>
-            <w:proofErr w:type="spellStart"/>
-            <w:r>
-              <w:rPr>
-                <w:rFonts w:ascii="Calibri" w:hAnsi="Calibri" w:cs="Calibri"/>
-              </w:rPr>
-              <w:t>Polituff</w:t>
-            </w:r>
-            <w:proofErr w:type="spellEnd"/>
-            <w:r>
-              <w:rPr>
-                <w:rFonts w:ascii="Calibri" w:hAnsi="Calibri" w:cs="Calibri"/>
-              </w:rPr>
-              <w:t xml:space="preserve"> (Body filler) w/ hardener</w:t>
+            <w:r>
+              <w:rPr>
+                <w:rFonts w:ascii="Calibri" w:hAnsi="Calibri" w:cs="Calibri"/>
+              </w:rPr>
+              <w:t>Polituff (Body filler) w/ hardener</w:t>
             </w:r>
           </w:p>
         </w:tc>
@@ -12438,21 +12204,7 @@
               <w:rPr>
                 <w:rFonts w:ascii="Calibri" w:hAnsi="Calibri" w:cs="Calibri"/>
               </w:rPr>
-              <w:t xml:space="preserve">Quick Dry Enamel </w:t>
-            </w:r>
-            <w:proofErr w:type="gramStart"/>
-            <w:r>
-              <w:rPr>
-                <w:rFonts w:ascii="Calibri" w:hAnsi="Calibri" w:cs="Calibri"/>
-              </w:rPr>
-              <w:t>( white</w:t>
-            </w:r>
-            <w:proofErr w:type="gramEnd"/>
-            <w:r>
-              <w:rPr>
-                <w:rFonts w:ascii="Calibri" w:hAnsi="Calibri" w:cs="Calibri"/>
-              </w:rPr>
-              <w:t xml:space="preserve"> )</w:t>
+              <w:t>Quick Dry Enamel ( white )</w:t>
             </w:r>
           </w:p>
         </w:tc>
@@ -14333,30 +14085,8 @@
               <w:rPr>
                 <w:rFonts w:ascii="Calibri" w:hAnsi="Calibri" w:cs="Calibri"/>
               </w:rPr>
-              <w:t xml:space="preserve">Hose ½" Ø </w:t>
-            </w:r>
-            <w:proofErr w:type="gramStart"/>
-            <w:r>
-              <w:rPr>
-                <w:rFonts w:ascii="Calibri" w:hAnsi="Calibri" w:cs="Calibri"/>
-              </w:rPr>
-              <w:t>( 90</w:t>
-            </w:r>
-            <w:proofErr w:type="gramEnd"/>
-            <w:r>
-              <w:rPr>
-                <w:rFonts w:ascii="Calibri" w:hAnsi="Calibri" w:cs="Calibri"/>
-              </w:rPr>
-              <w:t xml:space="preserve"> meters/</w:t>
-            </w:r>
-            <w:proofErr w:type="gramStart"/>
-            <w:r>
-              <w:rPr>
-                <w:rFonts w:ascii="Calibri" w:hAnsi="Calibri" w:cs="Calibri"/>
-              </w:rPr>
-              <w:t>roll )</w:t>
-            </w:r>
-            <w:proofErr w:type="gramEnd"/>
+              <w:t>Hose ½" Ø ( 90 meters/roll )</w:t>
+            </w:r>
           </w:p>
         </w:tc>
         <w:tc>
@@ -15534,25 +15264,7 @@
                 <w:sz w:val="22"/>
                 <w:szCs w:val="22"/>
               </w:rPr>
-              <w:t xml:space="preserve">Strong Rubberized </w:t>
-            </w:r>
-            <w:proofErr w:type="gramStart"/>
-            <w:r>
-              <w:rPr>
-                <w:rFonts w:ascii="Calibri" w:hAnsi="Calibri" w:cs="Calibri"/>
-                <w:sz w:val="22"/>
-                <w:szCs w:val="22"/>
-              </w:rPr>
-              <w:t>Water Proof</w:t>
-            </w:r>
-            <w:proofErr w:type="gramEnd"/>
-            <w:r>
-              <w:rPr>
-                <w:rFonts w:ascii="Calibri" w:hAnsi="Calibri" w:cs="Calibri"/>
-                <w:sz w:val="22"/>
-                <w:szCs w:val="22"/>
-              </w:rPr>
-              <w:t xml:space="preserve"> Tape 4"x 5ft, flex tape</w:t>
+              <w:t>Strong Rubberized Water Proof Tape 4"x 5ft, flex tape</w:t>
             </w:r>
           </w:p>
         </w:tc>
@@ -15992,19 +15704,11 @@
                 <w:rFonts w:ascii="Calibri" w:hAnsi="Calibri" w:cs="Calibri"/>
               </w:rPr>
             </w:pPr>
-            <w:proofErr w:type="gramStart"/>
-            <w:r>
-              <w:rPr>
-                <w:rFonts w:ascii="Calibri" w:hAnsi="Calibri" w:cs="Calibri"/>
-              </w:rPr>
-              <w:t>Teflon  tape</w:t>
-            </w:r>
-            <w:proofErr w:type="gramEnd"/>
-            <w:r>
-              <w:rPr>
-                <w:rFonts w:ascii="Calibri" w:hAnsi="Calibri" w:cs="Calibri"/>
-              </w:rPr>
-              <w:t xml:space="preserve"> ¾</w:t>
+            <w:r>
+              <w:rPr>
+                <w:rFonts w:ascii="Calibri" w:hAnsi="Calibri" w:cs="Calibri"/>
+              </w:rPr>
+              <w:t>Teflon  tape ¾</w:t>
             </w:r>
           </w:p>
         </w:tc>
@@ -17533,19 +17237,11 @@
                 <w:rFonts w:ascii="Calibri" w:hAnsi="Calibri" w:cs="Calibri"/>
               </w:rPr>
             </w:pPr>
-            <w:proofErr w:type="spellStart"/>
-            <w:r>
-              <w:rPr>
-                <w:rFonts w:ascii="Calibri" w:hAnsi="Calibri" w:cs="Calibri"/>
-              </w:rPr>
-              <w:t>Flatcord</w:t>
-            </w:r>
-            <w:proofErr w:type="spellEnd"/>
-            <w:r>
-              <w:rPr>
-                <w:rFonts w:ascii="Calibri" w:hAnsi="Calibri" w:cs="Calibri"/>
-              </w:rPr>
-              <w:t xml:space="preserve"> # 16</w:t>
+            <w:r>
+              <w:rPr>
+                <w:rFonts w:ascii="Calibri" w:hAnsi="Calibri" w:cs="Calibri"/>
+              </w:rPr>
+              <w:t>Flatcord # 16</w:t>
             </w:r>
           </w:p>
         </w:tc>
@@ -17668,19 +17364,11 @@
                 <w:rFonts w:ascii="Calibri" w:hAnsi="Calibri" w:cs="Calibri"/>
               </w:rPr>
             </w:pPr>
-            <w:proofErr w:type="spellStart"/>
-            <w:r>
-              <w:rPr>
-                <w:rFonts w:ascii="Calibri" w:hAnsi="Calibri" w:cs="Calibri"/>
-              </w:rPr>
-              <w:t>Flourescent</w:t>
-            </w:r>
-            <w:proofErr w:type="spellEnd"/>
-            <w:r>
-              <w:rPr>
-                <w:rFonts w:ascii="Calibri" w:hAnsi="Calibri" w:cs="Calibri"/>
-              </w:rPr>
-              <w:t xml:space="preserve"> tube bulb 15 watts LED</w:t>
+            <w:r>
+              <w:rPr>
+                <w:rFonts w:ascii="Calibri" w:hAnsi="Calibri" w:cs="Calibri"/>
+              </w:rPr>
+              <w:t>Flourescent tube bulb 15 watts LED</w:t>
             </w:r>
           </w:p>
         </w:tc>
@@ -18208,21 +17896,7 @@
               <w:rPr>
                 <w:rFonts w:ascii="Calibri" w:hAnsi="Calibri" w:cs="Calibri"/>
               </w:rPr>
-              <w:t xml:space="preserve">LED Bulb 10 watts </w:t>
-            </w:r>
-            <w:proofErr w:type="gramStart"/>
-            <w:r>
-              <w:rPr>
-                <w:rFonts w:ascii="Calibri" w:hAnsi="Calibri" w:cs="Calibri"/>
-              </w:rPr>
-              <w:t>( daylight</w:t>
-            </w:r>
-            <w:proofErr w:type="gramEnd"/>
-            <w:r>
-              <w:rPr>
-                <w:rFonts w:ascii="Calibri" w:hAnsi="Calibri" w:cs="Calibri"/>
-              </w:rPr>
-              <w:t xml:space="preserve"> )          </w:t>
+              <w:t xml:space="preserve">LED Bulb 10 watts ( daylight )          </w:t>
             </w:r>
           </w:p>
         </w:tc>
@@ -18887,21 +18561,7 @@
               <w:rPr>
                 <w:rFonts w:ascii="Calibri" w:hAnsi="Calibri" w:cs="Calibri"/>
               </w:rPr>
-              <w:t xml:space="preserve">PVC </w:t>
-            </w:r>
-            <w:proofErr w:type="spellStart"/>
-            <w:r>
-              <w:rPr>
-                <w:rFonts w:ascii="Calibri" w:hAnsi="Calibri" w:cs="Calibri"/>
-              </w:rPr>
-              <w:t>Moulding</w:t>
-            </w:r>
-            <w:proofErr w:type="spellEnd"/>
-            <w:r>
-              <w:rPr>
-                <w:rFonts w:ascii="Calibri" w:hAnsi="Calibri" w:cs="Calibri"/>
-              </w:rPr>
-              <w:t xml:space="preserve"> 1</w:t>
+              <w:t>PVC Moulding 1</w:t>
             </w:r>
           </w:p>
         </w:tc>
@@ -19034,21 +18694,7 @@
               <w:rPr>
                 <w:rFonts w:ascii="Calibri" w:hAnsi="Calibri" w:cs="Calibri"/>
               </w:rPr>
-              <w:t xml:space="preserve">PVC </w:t>
-            </w:r>
-            <w:proofErr w:type="spellStart"/>
-            <w:r>
-              <w:rPr>
-                <w:rFonts w:ascii="Calibri" w:hAnsi="Calibri" w:cs="Calibri"/>
-              </w:rPr>
-              <w:t>Moulding</w:t>
-            </w:r>
-            <w:proofErr w:type="spellEnd"/>
-            <w:r>
-              <w:rPr>
-                <w:rFonts w:ascii="Calibri" w:hAnsi="Calibri" w:cs="Calibri"/>
-              </w:rPr>
-              <w:t xml:space="preserve"> ¾</w:t>
+              <w:t>PVC Moulding ¾</w:t>
             </w:r>
           </w:p>
         </w:tc>
@@ -19181,35 +18827,7 @@
               <w:rPr>
                 <w:rFonts w:ascii="Calibri" w:hAnsi="Calibri" w:cs="Calibri"/>
               </w:rPr>
-              <w:t xml:space="preserve">Rubber Plug </w:t>
-            </w:r>
-            <w:proofErr w:type="gramStart"/>
-            <w:r>
-              <w:rPr>
-                <w:rFonts w:ascii="Calibri" w:hAnsi="Calibri" w:cs="Calibri"/>
-              </w:rPr>
-              <w:t>( heavy</w:t>
-            </w:r>
-            <w:proofErr w:type="gramEnd"/>
-            <w:r>
-              <w:rPr>
-                <w:rFonts w:ascii="Calibri" w:hAnsi="Calibri" w:cs="Calibri"/>
-              </w:rPr>
-              <w:t xml:space="preserve"> </w:t>
-            </w:r>
-            <w:proofErr w:type="gramStart"/>
-            <w:r>
-              <w:rPr>
-                <w:rFonts w:ascii="Calibri" w:hAnsi="Calibri" w:cs="Calibri"/>
-              </w:rPr>
-              <w:t>Duty )</w:t>
-            </w:r>
-            <w:proofErr w:type="gramEnd"/>
-            <w:r>
-              <w:rPr>
-                <w:rFonts w:ascii="Calibri" w:hAnsi="Calibri" w:cs="Calibri"/>
-              </w:rPr>
-              <w:t xml:space="preserve"> (24pcs/box)</w:t>
+              <w:t>Rubber Plug ( heavy Duty ) (24pcs/box)</w:t>
             </w:r>
           </w:p>
         </w:tc>
@@ -21741,21 +21359,7 @@
               <w:rPr>
                 <w:rFonts w:ascii="Calibri" w:hAnsi="Calibri" w:cs="Calibri"/>
               </w:rPr>
-              <w:t xml:space="preserve">") x 30m (100ft) -double jacketed with rubber lining; 300 Psi </w:t>
-            </w:r>
-            <w:proofErr w:type="gramStart"/>
-            <w:r>
-              <w:rPr>
-                <w:rFonts w:ascii="Calibri" w:hAnsi="Calibri" w:cs="Calibri"/>
-              </w:rPr>
-              <w:t>wp;  900</w:t>
-            </w:r>
-            <w:proofErr w:type="gramEnd"/>
-            <w:r>
-              <w:rPr>
-                <w:rFonts w:ascii="Calibri" w:hAnsi="Calibri" w:cs="Calibri"/>
-              </w:rPr>
-              <w:t>Psi bp</w:t>
+              <w:t>") x 30m (100ft) -double jacketed with rubber lining; 300 Psi wp;  900Psi bp</w:t>
             </w:r>
           </w:p>
         </w:tc>
@@ -21888,16 +21492,8 @@
               <w:rPr>
                 <w:rFonts w:ascii="Calibri" w:hAnsi="Calibri" w:cs="Calibri"/>
               </w:rPr>
-              <w:t xml:space="preserve">Fire hose 1.5" x 50ft. With brass coupling double jacketed, NST (NH) </w:t>
-            </w:r>
-            <w:proofErr w:type="spellStart"/>
-            <w:r>
-              <w:rPr>
-                <w:rFonts w:ascii="Calibri" w:hAnsi="Calibri" w:cs="Calibri"/>
-              </w:rPr>
-              <w:t>Gaspang</w:t>
-            </w:r>
-            <w:proofErr w:type="spellEnd"/>
+              <w:t>Fire hose 1.5" x 50ft. With brass coupling double jacketed, NST (NH) Gaspang</w:t>
+            </w:r>
           </w:p>
         </w:tc>
         <w:tc>
@@ -22717,7 +22313,6 @@
                 <w:rFonts w:ascii="Calibri" w:hAnsi="Calibri" w:cs="Calibri"/>
               </w:rPr>
             </w:pPr>
-            <w:proofErr w:type="gramStart"/>
             <w:r>
               <w:rPr>
                 <w:rFonts w:ascii="Calibri" w:hAnsi="Calibri" w:cs="Calibri"/>
@@ -22725,7 +22320,6 @@
               </w:rPr>
               <w:t>20  pieces</w:t>
             </w:r>
-            <w:proofErr w:type="gramEnd"/>
           </w:p>
         </w:tc>
         <w:tc>
@@ -24809,19 +24403,11 @@
                 <w:rFonts w:ascii="Calibri" w:hAnsi="Calibri" w:cs="Calibri"/>
               </w:rPr>
             </w:pPr>
-            <w:proofErr w:type="spellStart"/>
-            <w:r>
-              <w:rPr>
-                <w:rFonts w:ascii="Calibri" w:hAnsi="Calibri" w:cs="Calibri"/>
-              </w:rPr>
-              <w:t>Trashbag</w:t>
-            </w:r>
-            <w:proofErr w:type="spellEnd"/>
-            <w:r>
-              <w:rPr>
-                <w:rFonts w:ascii="Calibri" w:hAnsi="Calibri" w:cs="Calibri"/>
-              </w:rPr>
-              <w:t xml:space="preserve"> medium 25pcs/roll black</w:t>
+            <w:r>
+              <w:rPr>
+                <w:rFonts w:ascii="Calibri" w:hAnsi="Calibri" w:cs="Calibri"/>
+              </w:rPr>
+              <w:t>Trashbag medium 25pcs/roll black</w:t>
             </w:r>
           </w:p>
         </w:tc>
@@ -24954,21 +24540,7 @@
               <w:rPr>
                 <w:rFonts w:ascii="Calibri" w:hAnsi="Calibri" w:cs="Calibri"/>
               </w:rPr>
-              <w:t xml:space="preserve">Seal it </w:t>
-            </w:r>
-            <w:proofErr w:type="gramStart"/>
-            <w:r>
-              <w:rPr>
-                <w:rFonts w:ascii="Calibri" w:hAnsi="Calibri" w:cs="Calibri"/>
-              </w:rPr>
-              <w:t>bag</w:t>
-            </w:r>
-            <w:proofErr w:type="gramEnd"/>
-            <w:r>
-              <w:rPr>
-                <w:rFonts w:ascii="Calibri" w:hAnsi="Calibri" w:cs="Calibri"/>
-              </w:rPr>
-              <w:t xml:space="preserve"> 84x120x0.04mm</w:t>
+              <w:t>Seal it bag 84x120x0.04mm</w:t>
             </w:r>
           </w:p>
         </w:tc>
@@ -28009,21 +27581,7 @@
               <w:rPr>
                 <w:rFonts w:ascii="Calibri" w:hAnsi="Calibri" w:cs="Calibri"/>
               </w:rPr>
-              <w:t>Walis Pang-</w:t>
-            </w:r>
-            <w:proofErr w:type="spellStart"/>
-            <w:r>
-              <w:rPr>
-                <w:rFonts w:ascii="Calibri" w:hAnsi="Calibri" w:cs="Calibri"/>
-              </w:rPr>
-              <w:t>agiw</w:t>
-            </w:r>
-            <w:proofErr w:type="spellEnd"/>
-            <w:r>
-              <w:rPr>
-                <w:rFonts w:ascii="Calibri" w:hAnsi="Calibri" w:cs="Calibri"/>
-              </w:rPr>
-              <w:t xml:space="preserve"> (Heavy duty)</w:t>
+              <w:t>Walis Pang-agiw (Heavy duty)</w:t>
             </w:r>
           </w:p>
         </w:tc>
@@ -28156,35 +27714,7 @@
               <w:rPr>
                 <w:rFonts w:ascii="Calibri" w:hAnsi="Calibri" w:cs="Calibri"/>
               </w:rPr>
-              <w:t xml:space="preserve">Walis </w:t>
-            </w:r>
-            <w:proofErr w:type="spellStart"/>
-            <w:r>
-              <w:rPr>
-                <w:rFonts w:ascii="Calibri" w:hAnsi="Calibri" w:cs="Calibri"/>
-              </w:rPr>
-              <w:t>tingting</w:t>
-            </w:r>
-            <w:proofErr w:type="spellEnd"/>
-            <w:r>
-              <w:rPr>
-                <w:rFonts w:ascii="Calibri" w:hAnsi="Calibri" w:cs="Calibri"/>
-              </w:rPr>
-              <w:t xml:space="preserve"> (</w:t>
-            </w:r>
-            <w:proofErr w:type="spellStart"/>
-            <w:r>
-              <w:rPr>
-                <w:rFonts w:ascii="Calibri" w:hAnsi="Calibri" w:cs="Calibri"/>
-              </w:rPr>
-              <w:t>kaong</w:t>
-            </w:r>
-            <w:proofErr w:type="spellEnd"/>
-            <w:r>
-              <w:rPr>
-                <w:rFonts w:ascii="Calibri" w:hAnsi="Calibri" w:cs="Calibri"/>
-              </w:rPr>
-              <w:t>)</w:t>
+              <w:t>Walis tingting (kaong)</w:t>
             </w:r>
           </w:p>
         </w:tc>
@@ -28700,25 +28230,7 @@
                 <w:sz w:val="22"/>
                 <w:szCs w:val="22"/>
               </w:rPr>
-              <w:t xml:space="preserve">5-1 Digester - Water </w:t>
-            </w:r>
-            <w:proofErr w:type="gramStart"/>
-            <w:r>
-              <w:rPr>
-                <w:rFonts w:ascii="Calibri" w:hAnsi="Calibri" w:cs="Calibri"/>
-                <w:sz w:val="22"/>
-                <w:szCs w:val="22"/>
-              </w:rPr>
-              <w:t>Digester ;</w:t>
-            </w:r>
-            <w:proofErr w:type="gramEnd"/>
-            <w:r>
-              <w:rPr>
-                <w:rFonts w:ascii="Calibri" w:hAnsi="Calibri" w:cs="Calibri"/>
-                <w:sz w:val="22"/>
-                <w:szCs w:val="22"/>
-              </w:rPr>
-              <w:t xml:space="preserve"> Odor Eliminator; Mosquito Repellant; Flies Control; Disinfectant/Deodorizer</w:t>
+              <w:t>5-1 Digester - Water Digester ; Odor Eliminator; Mosquito Repellant; Flies Control; Disinfectant/Deodorizer</w:t>
             </w:r>
           </w:p>
         </w:tc>
@@ -30229,23 +29741,7 @@
           <w:rFonts w:asciiTheme="minorHAnsi" w:hAnsiTheme="minorHAnsi" w:cstheme="minorHAnsi"/>
           <w:b/>
         </w:rPr>
-        <w:t xml:space="preserve">Reviewed and found to </w:t>
-      </w:r>
-      <w:proofErr w:type="gramStart"/>
-      <w:r>
-        <w:rPr>
-          <w:rFonts w:asciiTheme="minorHAnsi" w:hAnsiTheme="minorHAnsi" w:cstheme="minorHAnsi"/>
-          <w:b/>
-        </w:rPr>
-        <w:t>be</w:t>
-      </w:r>
-      <w:proofErr w:type="gramEnd"/>
-      <w:r>
-        <w:rPr>
-          <w:rFonts w:asciiTheme="minorHAnsi" w:hAnsiTheme="minorHAnsi" w:cstheme="minorHAnsi"/>
-          <w:b/>
-        </w:rPr>
-        <w:t xml:space="preserve"> accordance with the A</w:t>
+        <w:t>Reviewed and found to be accordance with the A</w:t>
       </w:r>
       <w:r>
         <w:rPr>

</xml_diff>